<commit_message>
chore: add resume delivery artifacts
</commit_message>
<xml_diff>
--- a/231411010048-王玉隆-软件工程平时作业（一）.docx
+++ b/231411010048-王玉隆-软件工程平时作业（一）.docx
@@ -1379,6 +1379,7 @@
           <w:p>
             <w:pPr>
               <w:spacing w:after="120" w:line="276" w:lineRule="auto"/>
+              <w:ind w:firstLineChars="100" w:firstLine="241"/>
             </w:pPr>
             <w:r>
               <w:rPr>
@@ -1801,10 +1802,10 @@
                 <w:color w:val="000000"/>
               </w:rPr>
               <w:drawing>
-                <wp:inline distT="0" distB="0" distL="0" distR="0" wp14:anchorId="0276EA35" wp14:editId="2703B019">
-                  <wp:extent cx="5074920" cy="2348226"/>
-                  <wp:effectExtent l="0" t="0" r="0" b="0"/>
-                  <wp:docPr id="4" name="Picture 4"/>
+                <wp:inline distT="0" distB="0" distL="0" distR="0" wp14:anchorId="1A93093E" wp14:editId="15D64A32">
+                  <wp:extent cx="5274310" cy="3300730"/>
+                  <wp:effectExtent l="0" t="0" r="2540" b="0"/>
+                  <wp:docPr id="885932473" name="图片 1"/>
                   <wp:cNvGraphicFramePr>
                     <a:graphicFrameLocks xmlns:a="http://schemas.openxmlformats.org/drawingml/2006/main" noChangeAspect="1"/>
                   </wp:cNvGraphicFramePr>
@@ -1812,11 +1813,11 @@
                     <a:graphicData uri="http://schemas.openxmlformats.org/drawingml/2006/picture">
                       <pic:pic xmlns:pic="http://schemas.openxmlformats.org/drawingml/2006/picture">
                         <pic:nvPicPr>
-                          <pic:cNvPr id="0" name="install-ai-study.png"/>
+                          <pic:cNvPr id="885932473" name=""/>
                           <pic:cNvPicPr/>
                         </pic:nvPicPr>
                         <pic:blipFill>
-                          <a:blip r:embed="rId7"/>
+                          <a:blip r:embed="rId8"/>
                           <a:stretch>
                             <a:fillRect/>
                           </a:stretch>
@@ -1824,7 +1825,7 @@
                         <pic:spPr>
                           <a:xfrm>
                             <a:off x="0" y="0"/>
-                            <a:ext cx="5074920" cy="2348226"/>
+                            <a:ext cx="5274310" cy="3300730"/>
                           </a:xfrm>
                           <a:prstGeom prst="rect">
                             <a:avLst/>
@@ -1951,6 +1952,7 @@
                 <w:b/>
                 <w:color w:val="000000"/>
               </w:rPr>
+              <w:lastRenderedPageBreak/>
               <w:t>实验步骤</w:t>
             </w:r>
           </w:p>
@@ -2000,7 +2002,6 @@
                 <w:b/>
                 <w:color w:val="000000"/>
               </w:rPr>
-              <w:lastRenderedPageBreak/>
               <w:t>实验结果</w:t>
             </w:r>
           </w:p>
@@ -2042,7 +2043,7 @@
                           <pic:cNvPicPr/>
                         </pic:nvPicPr>
                         <pic:blipFill>
-                          <a:blip r:embed="rId8"/>
+                          <a:blip r:embed="rId9"/>
                           <a:stretch>
                             <a:fillRect/>
                           </a:stretch>
@@ -2095,170 +2096,217 @@
                 <w:color w:val="000000"/>
                 <w:sz w:val="24"/>
               </w:rPr>
+              <w:t>额外实验：利用</w:t>
+            </w:r>
+            <w:proofErr w:type="spellStart"/>
+            <w:r>
+              <w:rPr>
+                <w:rFonts w:ascii="宋体" w:hAnsi="宋体"/>
+                <w:b/>
+                <w:color w:val="000000"/>
+                <w:sz w:val="24"/>
+              </w:rPr>
+              <w:t>OpenClaw</w:t>
+            </w:r>
+            <w:proofErr w:type="spellEnd"/>
+            <w:r>
+              <w:rPr>
+                <w:rFonts w:ascii="宋体" w:hAnsi="宋体"/>
+                <w:b/>
+                <w:color w:val="000000"/>
+                <w:sz w:val="24"/>
+              </w:rPr>
+              <w:t xml:space="preserve"> or </w:t>
+            </w:r>
+            <w:proofErr w:type="spellStart"/>
+            <w:r>
+              <w:rPr>
+                <w:rFonts w:ascii="宋体" w:hAnsi="宋体"/>
+                <w:b/>
+                <w:color w:val="000000"/>
+                <w:sz w:val="24"/>
+              </w:rPr>
+              <w:t>ClaudeCode</w:t>
+            </w:r>
+            <w:proofErr w:type="spellEnd"/>
+            <w:r>
+              <w:rPr>
+                <w:rFonts w:ascii="宋体" w:hAnsi="宋体"/>
+                <w:b/>
+                <w:color w:val="000000"/>
+                <w:sz w:val="24"/>
+              </w:rPr>
+              <w:t>创新应用</w:t>
+            </w:r>
+          </w:p>
+          <w:p>
+            <w:pPr>
+              <w:spacing w:after="40" w:line="269" w:lineRule="auto"/>
+            </w:pPr>
+            <w:r>
+              <w:rPr>
+                <w:rFonts w:ascii="宋体" w:hAnsi="宋体"/>
+                <w:b/>
+                <w:color w:val="000000"/>
+              </w:rPr>
+              <w:t>实验步骤</w:t>
+            </w:r>
+          </w:p>
+          <w:p>
+            <w:pPr>
+              <w:spacing w:after="40" w:line="269" w:lineRule="auto"/>
+            </w:pPr>
+            <w:r>
+              <w:rPr>
+                <w:rFonts w:ascii="宋体" w:hAnsi="宋体"/>
+                <w:color w:val="000000"/>
+              </w:rPr>
+              <w:t xml:space="preserve">（1）选择 D:\code\ai-study 作为实践项目，阅读 README、前端 </w:t>
+            </w:r>
+            <w:proofErr w:type="spellStart"/>
+            <w:r>
+              <w:rPr>
+                <w:rFonts w:ascii="宋体" w:hAnsi="宋体"/>
+                <w:color w:val="000000"/>
+              </w:rPr>
+              <w:t>package.json</w:t>
+            </w:r>
+            <w:proofErr w:type="spellEnd"/>
+            <w:r>
+              <w:rPr>
+                <w:rFonts w:ascii="宋体" w:hAnsi="宋体"/>
+                <w:color w:val="000000"/>
+              </w:rPr>
+              <w:t>、API 文档和项目目录结构。</w:t>
+            </w:r>
+          </w:p>
+          <w:p>
+            <w:pPr>
+              <w:spacing w:after="40" w:line="269" w:lineRule="auto"/>
+            </w:pPr>
+            <w:r>
+              <w:rPr>
+                <w:rFonts w:ascii="宋体" w:hAnsi="宋体"/>
+                <w:color w:val="000000"/>
+              </w:rPr>
+              <w:t xml:space="preserve">（2）运行 </w:t>
+            </w:r>
+            <w:proofErr w:type="spellStart"/>
+            <w:r>
+              <w:rPr>
+                <w:rFonts w:ascii="宋体" w:hAnsi="宋体"/>
+                <w:color w:val="000000"/>
+              </w:rPr>
+              <w:t>npm</w:t>
+            </w:r>
+            <w:proofErr w:type="spellEnd"/>
+            <w:r>
+              <w:rPr>
+                <w:rFonts w:ascii="宋体" w:hAnsi="宋体"/>
+                <w:color w:val="000000"/>
+              </w:rPr>
+              <w:t xml:space="preserve"> run build，对 Next.js 前端进行构建验证，确认主要页面能够正常编译。</w:t>
+            </w:r>
+          </w:p>
+          <w:p>
+            <w:pPr>
+              <w:spacing w:after="40" w:line="269" w:lineRule="auto"/>
+            </w:pPr>
+            <w:r>
+              <w:rPr>
+                <w:rFonts w:ascii="宋体" w:hAnsi="宋体"/>
+                <w:color w:val="000000"/>
+              </w:rPr>
+              <w:t>（3）启动 Spring Boot 后端和 Next.js 前端，依次体验题库、知识训练、模拟面试、学习中心、AI 诊断和 RAG 相关能力。</w:t>
+            </w:r>
+          </w:p>
+          <w:p>
+            <w:pPr>
+              <w:spacing w:after="40" w:line="269" w:lineRule="auto"/>
+            </w:pPr>
+            <w:r>
+              <w:rPr>
+                <w:rFonts w:ascii="宋体" w:hAnsi="宋体"/>
+                <w:color w:val="000000"/>
+              </w:rPr>
+              <w:t>（4）使用截</w:t>
+            </w:r>
+            <w:proofErr w:type="gramStart"/>
+            <w:r>
+              <w:rPr>
+                <w:rFonts w:ascii="宋体" w:hAnsi="宋体"/>
+                <w:color w:val="000000"/>
+              </w:rPr>
+              <w:t>图记录</w:t>
+            </w:r>
+            <w:proofErr w:type="gramEnd"/>
+            <w:r>
+              <w:rPr>
+                <w:rFonts w:ascii="宋体" w:hAnsi="宋体"/>
+                <w:color w:val="000000"/>
+              </w:rPr>
+              <w:t>关键页面，其中知识训练展开了具体问题，模拟面试展示开始后的进行页面。</w:t>
+            </w:r>
+          </w:p>
+          <w:p>
+            <w:pPr>
+              <w:spacing w:after="40" w:line="269" w:lineRule="auto"/>
+            </w:pPr>
+            <w:r>
+              <w:rPr>
+                <w:rFonts w:ascii="宋体" w:hAnsi="宋体"/>
+                <w:b/>
+                <w:color w:val="000000"/>
+              </w:rPr>
+              <w:t>项目介绍</w:t>
+            </w:r>
+          </w:p>
+          <w:p>
+            <w:pPr>
+              <w:spacing w:after="80" w:line="269" w:lineRule="auto"/>
+            </w:pPr>
+            <w:r>
+              <w:rPr>
+                <w:rFonts w:ascii="宋体" w:hAnsi="宋体"/>
+                <w:color w:val="000000"/>
+              </w:rPr>
+              <w:t>ai-study 项目全称为 AI Interview Coach Agent，是一个面向 Java 后端求职者的 AI 面试教练系统。项目不是单纯</w:t>
+            </w:r>
+            <w:proofErr w:type="gramStart"/>
+            <w:r>
+              <w:rPr>
+                <w:rFonts w:ascii="宋体" w:hAnsi="宋体"/>
+                <w:color w:val="000000"/>
+              </w:rPr>
+              <w:t>的刷题页面</w:t>
+            </w:r>
+            <w:proofErr w:type="gramEnd"/>
+            <w:r>
+              <w:rPr>
+                <w:rFonts w:ascii="宋体" w:hAnsi="宋体"/>
+                <w:color w:val="000000"/>
+              </w:rPr>
+              <w:t>，也不是普通聊天机器人，而是围绕“题目练习、代码提交、结果诊断、知识复盘、训练计划”形成学习闭环。</w:t>
+            </w:r>
+          </w:p>
+          <w:p>
+            <w:pPr>
+              <w:spacing w:after="80" w:line="269" w:lineRule="auto"/>
+            </w:pPr>
+            <w:r>
+              <w:rPr>
+                <w:rFonts w:ascii="宋体" w:hAnsi="宋体"/>
+                <w:color w:val="000000"/>
+              </w:rPr>
+              <w:t xml:space="preserve">项目首页提供算法题库，可以按难度和知识点筛选题目；题目详情页集成代码编辑、提交测试和 AI 诊断，能够根据错误结果给出失败现象、原因分析和修改方向；知识训练模块把 </w:t>
+            </w:r>
+            <w:r>
+              <w:rPr>
+                <w:rFonts w:ascii="宋体" w:hAnsi="宋体"/>
+                <w:color w:val="000000"/>
+              </w:rPr>
               <w:lastRenderedPageBreak/>
-              <w:t>额外实验：利用</w:t>
-            </w:r>
-            <w:proofErr w:type="spellStart"/>
-            <w:r>
-              <w:rPr>
-                <w:rFonts w:ascii="宋体" w:hAnsi="宋体"/>
-                <w:b/>
-                <w:color w:val="000000"/>
-                <w:sz w:val="24"/>
-              </w:rPr>
-              <w:t>OpenClaw</w:t>
-            </w:r>
-            <w:proofErr w:type="spellEnd"/>
-            <w:r>
-              <w:rPr>
-                <w:rFonts w:ascii="宋体" w:hAnsi="宋体"/>
-                <w:b/>
-                <w:color w:val="000000"/>
-                <w:sz w:val="24"/>
-              </w:rPr>
-              <w:t xml:space="preserve"> or </w:t>
-            </w:r>
-            <w:proofErr w:type="spellStart"/>
-            <w:r>
-              <w:rPr>
-                <w:rFonts w:ascii="宋体" w:hAnsi="宋体"/>
-                <w:b/>
-                <w:color w:val="000000"/>
-                <w:sz w:val="24"/>
-              </w:rPr>
-              <w:t>ClaudeCode</w:t>
-            </w:r>
-            <w:proofErr w:type="spellEnd"/>
-            <w:r>
-              <w:rPr>
-                <w:rFonts w:ascii="宋体" w:hAnsi="宋体"/>
-                <w:b/>
-                <w:color w:val="000000"/>
-                <w:sz w:val="24"/>
-              </w:rPr>
-              <w:t>创新应用</w:t>
-            </w:r>
-          </w:p>
-          <w:p>
-            <w:pPr>
-              <w:spacing w:after="40" w:line="269" w:lineRule="auto"/>
-            </w:pPr>
-            <w:r>
-              <w:rPr>
-                <w:rFonts w:ascii="宋体" w:hAnsi="宋体"/>
-                <w:b/>
-                <w:color w:val="000000"/>
-              </w:rPr>
-              <w:t>实验步骤</w:t>
-            </w:r>
-          </w:p>
-          <w:p>
-            <w:pPr>
-              <w:spacing w:after="40" w:line="269" w:lineRule="auto"/>
-            </w:pPr>
-            <w:r>
-              <w:rPr>
-                <w:rFonts w:ascii="宋体" w:hAnsi="宋体"/>
-                <w:color w:val="000000"/>
-              </w:rPr>
-              <w:t xml:space="preserve">（1）选择 D:\code\ai-study 作为实践项目，阅读 README、前端 </w:t>
-            </w:r>
-            <w:proofErr w:type="spellStart"/>
-            <w:r>
-              <w:rPr>
-                <w:rFonts w:ascii="宋体" w:hAnsi="宋体"/>
-                <w:color w:val="000000"/>
-              </w:rPr>
-              <w:t>package.json</w:t>
-            </w:r>
-            <w:proofErr w:type="spellEnd"/>
-            <w:r>
-              <w:rPr>
-                <w:rFonts w:ascii="宋体" w:hAnsi="宋体"/>
-                <w:color w:val="000000"/>
-              </w:rPr>
-              <w:t>、API 文档和项目目录结构。</w:t>
-            </w:r>
-          </w:p>
-          <w:p>
-            <w:pPr>
-              <w:spacing w:after="40" w:line="269" w:lineRule="auto"/>
-            </w:pPr>
-            <w:r>
-              <w:rPr>
-                <w:rFonts w:ascii="宋体" w:hAnsi="宋体"/>
-                <w:color w:val="000000"/>
-              </w:rPr>
-              <w:t xml:space="preserve">（2）运行 </w:t>
-            </w:r>
-            <w:proofErr w:type="spellStart"/>
-            <w:r>
-              <w:rPr>
-                <w:rFonts w:ascii="宋体" w:hAnsi="宋体"/>
-                <w:color w:val="000000"/>
-              </w:rPr>
-              <w:t>npm</w:t>
-            </w:r>
-            <w:proofErr w:type="spellEnd"/>
-            <w:r>
-              <w:rPr>
-                <w:rFonts w:ascii="宋体" w:hAnsi="宋体"/>
-                <w:color w:val="000000"/>
-              </w:rPr>
-              <w:t xml:space="preserve"> run build，对 Next.js 前端进行构建验证，确认主要页面能够正常编译。</w:t>
-            </w:r>
-          </w:p>
-          <w:p>
-            <w:pPr>
-              <w:spacing w:after="40" w:line="269" w:lineRule="auto"/>
-            </w:pPr>
-            <w:r>
-              <w:rPr>
-                <w:rFonts w:ascii="宋体" w:hAnsi="宋体"/>
-                <w:color w:val="000000"/>
-              </w:rPr>
-              <w:t>（3）启动 Spring Boot 后端和 Next.js 前端，依次体验题库、知识训练、模拟面试、学习中心、AI 诊断和 RAG 相关能力。</w:t>
-            </w:r>
-          </w:p>
-          <w:p>
-            <w:pPr>
-              <w:spacing w:after="40" w:line="269" w:lineRule="auto"/>
-            </w:pPr>
-            <w:r>
-              <w:rPr>
-                <w:rFonts w:ascii="宋体" w:hAnsi="宋体"/>
-                <w:color w:val="000000"/>
-              </w:rPr>
-              <w:t>（4）使用截</w:t>
-            </w:r>
-            <w:proofErr w:type="gramStart"/>
-            <w:r>
-              <w:rPr>
-                <w:rFonts w:ascii="宋体" w:hAnsi="宋体"/>
-                <w:color w:val="000000"/>
-              </w:rPr>
-              <w:t>图记录</w:t>
-            </w:r>
-            <w:proofErr w:type="gramEnd"/>
-            <w:r>
-              <w:rPr>
-                <w:rFonts w:ascii="宋体" w:hAnsi="宋体"/>
-                <w:color w:val="000000"/>
-              </w:rPr>
-              <w:t>关键页面，其中知识训练展开了具体问题，模拟面试展示开始后的进行页面。</w:t>
-            </w:r>
-          </w:p>
-          <w:p>
-            <w:pPr>
-              <w:spacing w:after="40" w:line="269" w:lineRule="auto"/>
-            </w:pPr>
-            <w:r>
-              <w:rPr>
-                <w:rFonts w:ascii="宋体" w:hAnsi="宋体"/>
-                <w:b/>
-                <w:color w:val="000000"/>
-              </w:rPr>
-              <w:t>项目介绍</w:t>
+              <w:t>Java、JVM、Spring、MySQL、Redis 等高频面试知识整理为可展开训练卡片；模拟面试模块支持选择方向和题数，开始后进入一问一答式训练；学习中心汇总提交次数、通过题目、薄弱知识点和后续训练计划。</w:t>
             </w:r>
           </w:p>
           <w:p>
@@ -2270,55 +2318,7 @@
                 <w:rFonts w:ascii="宋体" w:hAnsi="宋体"/>
                 <w:color w:val="000000"/>
               </w:rPr>
-              <w:t>ai-study 项目全称为 AI Interview Coach Agent，是一个面向 Java 后端求职者的 AI 面试教练系统。项目不是单纯</w:t>
-            </w:r>
-            <w:proofErr w:type="gramStart"/>
-            <w:r>
-              <w:rPr>
-                <w:rFonts w:ascii="宋体" w:hAnsi="宋体"/>
-                <w:color w:val="000000"/>
-              </w:rPr>
-              <w:t>的刷题页面</w:t>
-            </w:r>
-            <w:proofErr w:type="gramEnd"/>
-            <w:r>
-              <w:rPr>
-                <w:rFonts w:ascii="宋体" w:hAnsi="宋体"/>
-                <w:color w:val="000000"/>
-              </w:rPr>
-              <w:t>，也不是普通聊天机器人，而是围绕“题目练习、代码提交、结果诊断、知识复盘、训练计划”形成学习闭环。</w:t>
-            </w:r>
-          </w:p>
-          <w:p>
-            <w:pPr>
-              <w:spacing w:after="80" w:line="269" w:lineRule="auto"/>
-            </w:pPr>
-            <w:r>
-              <w:rPr>
-                <w:rFonts w:ascii="宋体" w:hAnsi="宋体"/>
-                <w:color w:val="000000"/>
-              </w:rPr>
-              <w:t>项目首页提供算法题库，可以按难度和知识点筛选题目；题目详情页集成代码编辑、提交测试和 AI 诊断，能够根据错误结果给出失败现象、原因分析和修改方向；知识训练模块把 Java、JVM、Spring、MySQL、Redis 等高频面试知识整理为可展开训练卡片；模拟面试模块支持选择方向和题数，开始后进入一问一答式训练；学习中心汇总提交次数、通过题目、薄弱知识点和后续训练计划。</w:t>
-            </w:r>
-          </w:p>
-          <w:p>
-            <w:pPr>
-              <w:spacing w:after="80" w:line="269" w:lineRule="auto"/>
-            </w:pPr>
-            <w:r>
-              <w:rPr>
-                <w:rFonts w:ascii="宋体" w:hAnsi="宋体"/>
-                <w:color w:val="000000"/>
-              </w:rPr>
-              <w:t>项目还包含 RAG 能力：Agent 诊断流程中有 RAG_RETRIEVAL 步骤，会检索题目知识、知识卡和用户历史学习记忆；系统提供 /rag-chat 受控学习资料问答入口，只围绕题目、知识</w:t>
-            </w:r>
-            <w:r>
-              <w:rPr>
-                <w:rFonts w:ascii="宋体" w:hAnsi="宋体"/>
-                <w:color w:val="000000"/>
-              </w:rPr>
-              <w:lastRenderedPageBreak/>
-              <w:t xml:space="preserve">卡、历史诊断、错题卡和学习记录回答；后端还设计了 RAG 健康检查、系统索引重建、失败向量重试等维护接口。RAG 默认可以基于 MySQL 的 </w:t>
+              <w:t xml:space="preserve">项目还包含 RAG 能力：Agent 诊断流程中有 RAG_RETRIEVAL 步骤，会检索题目知识、知识卡和用户历史学习记忆；系统提供 /rag-chat 受控学习资料问答入口，只围绕题目、知识卡、历史诊断、错题卡和学习记录回答；后端还设计了 RAG 健康检查、系统索引重建、失败向量重试等维护接口。RAG 默认可以基于 MySQL 的 </w:t>
             </w:r>
             <w:proofErr w:type="spellStart"/>
             <w:r>
@@ -2448,67 +2448,6 @@
                   <wp:extent cx="4617720" cy="2885398"/>
                   <wp:effectExtent l="0" t="0" r="0" b="0"/>
                   <wp:docPr id="6" name="Picture 6"/>
-                  <wp:cNvGraphicFramePr>
-                    <a:graphicFrameLocks xmlns:a="http://schemas.openxmlformats.org/drawingml/2006/main" noChangeAspect="1"/>
-                  </wp:cNvGraphicFramePr>
-                  <a:graphic xmlns:a="http://schemas.openxmlformats.org/drawingml/2006/main">
-                    <a:graphicData uri="http://schemas.openxmlformats.org/drawingml/2006/picture">
-                      <pic:pic xmlns:pic="http://schemas.openxmlformats.org/drawingml/2006/picture">
-                        <pic:nvPicPr>
-                          <pic:cNvPr id="0" name="image.png"/>
-                          <pic:cNvPicPr/>
-                        </pic:nvPicPr>
-                        <pic:blipFill>
-                          <a:blip r:embed="rId9"/>
-                          <a:stretch>
-                            <a:fillRect/>
-                          </a:stretch>
-                        </pic:blipFill>
-                        <pic:spPr>
-                          <a:xfrm>
-                            <a:off x="0" y="0"/>
-                            <a:ext cx="4617720" cy="2885398"/>
-                          </a:xfrm>
-                          <a:prstGeom prst="rect">
-                            <a:avLst/>
-                          </a:prstGeom>
-                        </pic:spPr>
-                      </pic:pic>
-                    </a:graphicData>
-                  </a:graphic>
-                </wp:inline>
-              </w:drawing>
-            </w:r>
-          </w:p>
-          <w:p>
-            <w:pPr>
-              <w:spacing w:after="120"/>
-              <w:jc w:val="center"/>
-            </w:pPr>
-            <w:r>
-              <w:rPr>
-                <w:rFonts w:ascii="宋体" w:hAnsi="宋体"/>
-                <w:color w:val="000000"/>
-                <w:sz w:val="19"/>
-              </w:rPr>
-              <w:t>图5-1 ai-study 首页算法题库截图</w:t>
-            </w:r>
-          </w:p>
-          <w:p>
-            <w:pPr>
-              <w:spacing w:before="80" w:after="40"/>
-              <w:jc w:val="center"/>
-            </w:pPr>
-            <w:r>
-              <w:rPr>
-                <w:noProof/>
-              </w:rPr>
-              <w:lastRenderedPageBreak/>
-              <w:drawing>
-                <wp:inline distT="0" distB="0" distL="0" distR="0" wp14:anchorId="46BB7DAE" wp14:editId="21D15A19">
-                  <wp:extent cx="4617720" cy="2885398"/>
-                  <wp:effectExtent l="0" t="0" r="0" b="0"/>
-                  <wp:docPr id="7" name="Picture 7"/>
                   <wp:cNvGraphicFramePr>
                     <a:graphicFrameLocks xmlns:a="http://schemas.openxmlformats.org/drawingml/2006/main" noChangeAspect="1"/>
                   </wp:cNvGraphicFramePr>
@@ -2552,7 +2491,7 @@
                 <w:color w:val="000000"/>
                 <w:sz w:val="19"/>
               </w:rPr>
-              <w:t>图5-2 ai-study 知识训练展开问题截图</w:t>
+              <w:t>图5-1 ai-study 首页算法题库截图</w:t>
             </w:r>
           </w:p>
           <w:p>
@@ -2564,11 +2503,12 @@
               <w:rPr>
                 <w:noProof/>
               </w:rPr>
+              <w:lastRenderedPageBreak/>
               <w:drawing>
-                <wp:inline distT="0" distB="0" distL="0" distR="0" wp14:anchorId="777A3B68" wp14:editId="27460C2E">
+                <wp:inline distT="0" distB="0" distL="0" distR="0" wp14:anchorId="46BB7DAE" wp14:editId="21D15A19">
                   <wp:extent cx="4617720" cy="2885398"/>
                   <wp:effectExtent l="0" t="0" r="0" b="0"/>
-                  <wp:docPr id="8" name="Picture 8"/>
+                  <wp:docPr id="7" name="Picture 7"/>
                   <wp:cNvGraphicFramePr>
                     <a:graphicFrameLocks xmlns:a="http://schemas.openxmlformats.org/drawingml/2006/main" noChangeAspect="1"/>
                   </wp:cNvGraphicFramePr>
@@ -2612,7 +2552,7 @@
                 <w:color w:val="000000"/>
                 <w:sz w:val="19"/>
               </w:rPr>
-              <w:t>图5-3 ai-study 模拟面试开始后页面截图</w:t>
+              <w:t>图5-2 ai-study 知识训练展开问题截图</w:t>
             </w:r>
           </w:p>
           <w:p>
@@ -2624,12 +2564,11 @@
               <w:rPr>
                 <w:noProof/>
               </w:rPr>
-              <w:lastRenderedPageBreak/>
               <w:drawing>
-                <wp:inline distT="0" distB="0" distL="0" distR="0" wp14:anchorId="454DFCE1" wp14:editId="5BEB181B">
+                <wp:inline distT="0" distB="0" distL="0" distR="0" wp14:anchorId="777A3B68" wp14:editId="27460C2E">
                   <wp:extent cx="4617720" cy="2885398"/>
                   <wp:effectExtent l="0" t="0" r="0" b="0"/>
-                  <wp:docPr id="9" name="Picture 9"/>
+                  <wp:docPr id="8" name="Picture 8"/>
                   <wp:cNvGraphicFramePr>
                     <a:graphicFrameLocks xmlns:a="http://schemas.openxmlformats.org/drawingml/2006/main" noChangeAspect="1"/>
                   </wp:cNvGraphicFramePr>
@@ -2673,6 +2612,67 @@
                 <w:color w:val="000000"/>
                 <w:sz w:val="19"/>
               </w:rPr>
+              <w:t>图5-3 ai-study 模拟面试开始后页面截图</w:t>
+            </w:r>
+          </w:p>
+          <w:p>
+            <w:pPr>
+              <w:spacing w:before="80" w:after="40"/>
+              <w:jc w:val="center"/>
+            </w:pPr>
+            <w:r>
+              <w:rPr>
+                <w:noProof/>
+              </w:rPr>
+              <w:lastRenderedPageBreak/>
+              <w:drawing>
+                <wp:inline distT="0" distB="0" distL="0" distR="0" wp14:anchorId="454DFCE1" wp14:editId="5BEB181B">
+                  <wp:extent cx="4617720" cy="2885398"/>
+                  <wp:effectExtent l="0" t="0" r="0" b="0"/>
+                  <wp:docPr id="9" name="Picture 9"/>
+                  <wp:cNvGraphicFramePr>
+                    <a:graphicFrameLocks xmlns:a="http://schemas.openxmlformats.org/drawingml/2006/main" noChangeAspect="1"/>
+                  </wp:cNvGraphicFramePr>
+                  <a:graphic xmlns:a="http://schemas.openxmlformats.org/drawingml/2006/main">
+                    <a:graphicData uri="http://schemas.openxmlformats.org/drawingml/2006/picture">
+                      <pic:pic xmlns:pic="http://schemas.openxmlformats.org/drawingml/2006/picture">
+                        <pic:nvPicPr>
+                          <pic:cNvPr id="0" name="image.png"/>
+                          <pic:cNvPicPr/>
+                        </pic:nvPicPr>
+                        <pic:blipFill>
+                          <a:blip r:embed="rId13"/>
+                          <a:stretch>
+                            <a:fillRect/>
+                          </a:stretch>
+                        </pic:blipFill>
+                        <pic:spPr>
+                          <a:xfrm>
+                            <a:off x="0" y="0"/>
+                            <a:ext cx="4617720" cy="2885398"/>
+                          </a:xfrm>
+                          <a:prstGeom prst="rect">
+                            <a:avLst/>
+                          </a:prstGeom>
+                        </pic:spPr>
+                      </pic:pic>
+                    </a:graphicData>
+                  </a:graphic>
+                </wp:inline>
+              </w:drawing>
+            </w:r>
+          </w:p>
+          <w:p>
+            <w:pPr>
+              <w:spacing w:after="120"/>
+              <w:jc w:val="center"/>
+            </w:pPr>
+            <w:r>
+              <w:rPr>
+                <w:rFonts w:ascii="宋体" w:hAnsi="宋体"/>
+                <w:color w:val="000000"/>
+                <w:sz w:val="19"/>
+              </w:rPr>
               <w:t>图5-4 ai-study 学习中心截图</w:t>
             </w:r>
           </w:p>
@@ -2701,7 +2701,7 @@
                           <pic:cNvPicPr/>
                         </pic:nvPicPr>
                         <pic:blipFill>
-                          <a:blip r:embed="rId13"/>
+                          <a:blip r:embed="rId14"/>
                           <a:stretch>
                             <a:fillRect/>
                           </a:stretch>

</xml_diff>